<commit_message>
fix: modified output formats
</commit_message>
<xml_diff>
--- a/output/cmp_infra_check_2026_W09.docx
+++ b/output/cmp_infra_check_2026_W09.docx
@@ -16,7 +16,7 @@
         <w:jc w:val="center"/>
       </w:pPr>
       <w:r>
-        <w:t>생성일시: 2026-02-24 18:01:56</w:t>
+        <w:t>생성일시: 2026-02-26 14:38:40</w:t>
         <w:br/>
       </w:r>
       <w:r>
@@ -138,7 +138,7 @@
               <w:jc w:val="center"/>
             </w:pPr>
             <w:r>
-              <w:t>98</w:t>
+              <w:t>91</w:t>
             </w:r>
           </w:p>
         </w:tc>
@@ -155,7 +155,7 @@
                 <w:b/>
                 <w:color w:val="008000"/>
               </w:rPr>
-              <w:t>83</w:t>
+              <w:t>78</w:t>
             </w:r>
           </w:p>
         </w:tc>
@@ -172,7 +172,7 @@
                 <w:b/>
                 <w:color w:val="FFA500"/>
               </w:rPr>
-              <w:t>0</w:t>
+              <w:t>2</w:t>
             </w:r>
           </w:p>
         </w:tc>
@@ -189,7 +189,7 @@
                 <w:b/>
                 <w:color w:val="FF0000"/>
               </w:rPr>
-              <w:t>14</w:t>
+              <w:t>11</w:t>
             </w:r>
           </w:p>
         </w:tc>
@@ -206,7 +206,7 @@
                 <w:b/>
                 <w:color w:val="808080"/>
               </w:rPr>
-              <w:t>1</w:t>
+              <w:t>0</w:t>
             </w:r>
           </w:p>
         </w:tc>
@@ -339,7 +339,7 @@
               <w:jc w:val="center"/>
             </w:pPr>
             <w:r>
-              <w:t>6</w:t>
+              <w:t>0</w:t>
             </w:r>
           </w:p>
         </w:tc>
@@ -365,7 +365,7 @@
               <w:jc w:val="center"/>
             </w:pPr>
             <w:r>
-              <w:t>0</w:t>
+              <w:t>6</w:t>
             </w:r>
           </w:p>
         </w:tc>
@@ -406,7 +406,7 @@
               <w:jc w:val="center"/>
             </w:pPr>
             <w:r>
-              <w:t>0</w:t>
+              <w:t>1</w:t>
             </w:r>
           </w:p>
         </w:tc>
@@ -445,7 +445,7 @@
               <w:jc w:val="center"/>
             </w:pPr>
             <w:r>
-              <w:t>1</w:t>
+              <w:t>0</w:t>
             </w:r>
           </w:p>
         </w:tc>
@@ -460,7 +460,7 @@
               <w:jc w:val="center"/>
             </w:pPr>
             <w:r>
-              <w:t>DEV</w:t>
+              <w:t>GPU</w:t>
             </w:r>
           </w:p>
         </w:tc>
@@ -486,7 +486,7 @@
               <w:jc w:val="center"/>
             </w:pPr>
             <w:r>
-              <w:t>0</w:t>
+              <w:t>2</w:t>
             </w:r>
           </w:p>
         </w:tc>
@@ -499,7 +499,7 @@
               <w:jc w:val="center"/>
             </w:pPr>
             <w:r>
-              <w:t>14</w:t>
+              <w:t>5</w:t>
             </w:r>
           </w:p>
         </w:tc>
@@ -645,7 +645,7 @@
               <w:jc w:val="center"/>
             </w:pPr>
             <w:r>
-              <w:t>6</w:t>
+              <w:t>0</w:t>
             </w:r>
           </w:p>
         </w:tc>
@@ -671,7 +671,7 @@
               <w:jc w:val="center"/>
             </w:pPr>
             <w:r>
-              <w:t>0</w:t>
+              <w:t>6</w:t>
             </w:r>
           </w:p>
         </w:tc>
@@ -712,7 +712,7 @@
               <w:jc w:val="center"/>
             </w:pPr>
             <w:r>
-              <w:t>0</w:t>
+              <w:t>1</w:t>
             </w:r>
           </w:p>
         </w:tc>
@@ -751,7 +751,7 @@
               <w:jc w:val="center"/>
             </w:pPr>
             <w:r>
-              <w:t>1</w:t>
+              <w:t>0</w:t>
             </w:r>
           </w:p>
         </w:tc>
@@ -766,7 +766,7 @@
               <w:jc w:val="center"/>
             </w:pPr>
             <w:r>
-              <w:t>DEV Master</w:t>
+              <w:t>GPU Master</w:t>
             </w:r>
           </w:p>
         </w:tc>
@@ -833,7 +833,7 @@
               <w:jc w:val="center"/>
             </w:pPr>
             <w:r>
-              <w:t>DEV Worker</w:t>
+              <w:t>GPU Worker</w:t>
             </w:r>
           </w:p>
         </w:tc>
@@ -913,7 +913,7 @@
               <w:jc w:val="center"/>
             </w:pPr>
             <w:r>
-              <w:t>7</w:t>
+              <w:t>5</w:t>
             </w:r>
           </w:p>
         </w:tc>
@@ -939,7 +939,7 @@
               <w:jc w:val="center"/>
             </w:pPr>
             <w:r>
-              <w:t>0</w:t>
+              <w:t>1</w:t>
             </w:r>
           </w:p>
         </w:tc>
@@ -980,7 +980,7 @@
               <w:jc w:val="center"/>
             </w:pPr>
             <w:r>
-              <w:t>10</w:t>
+              <w:t>8</w:t>
             </w:r>
           </w:p>
         </w:tc>
@@ -993,7 +993,7 @@
               <w:jc w:val="center"/>
             </w:pPr>
             <w:r>
-              <w:t>0</w:t>
+              <w:t>2</w:t>
             </w:r>
           </w:p>
         </w:tc>
@@ -1047,7 +1047,7 @@
               <w:jc w:val="center"/>
             </w:pPr>
             <w:r>
-              <w:t>0</w:t>
+              <w:t>1</w:t>
             </w:r>
           </w:p>
         </w:tc>
@@ -1073,7 +1073,7 @@
               <w:jc w:val="center"/>
             </w:pPr>
             <w:r>
-              <w:t>1</w:t>
+              <w:t>0</w:t>
             </w:r>
           </w:p>
         </w:tc>
@@ -1114,7 +1114,7 @@
               <w:jc w:val="center"/>
             </w:pPr>
             <w:r>
-              <w:t>0</w:t>
+              <w:t>2</w:t>
             </w:r>
           </w:p>
         </w:tc>
@@ -1140,7 +1140,7 @@
               <w:jc w:val="center"/>
             </w:pPr>
             <w:r>
-              <w:t>2</w:t>
+              <w:t>0</w:t>
             </w:r>
           </w:p>
         </w:tc>
@@ -1181,7 +1181,7 @@
               <w:jc w:val="center"/>
             </w:pPr>
             <w:r>
-              <w:t>0</w:t>
+              <w:t>1</w:t>
             </w:r>
           </w:p>
         </w:tc>
@@ -1207,7 +1207,7 @@
               <w:jc w:val="center"/>
             </w:pPr>
             <w:r>
-              <w:t>1</w:t>
+              <w:t>0</w:t>
             </w:r>
           </w:p>
         </w:tc>
@@ -1248,7 +1248,7 @@
               <w:jc w:val="center"/>
             </w:pPr>
             <w:r>
-              <w:t>0</w:t>
+              <w:t>2</w:t>
             </w:r>
           </w:p>
         </w:tc>
@@ -1274,7 +1274,7 @@
               <w:jc w:val="center"/>
             </w:pPr>
             <w:r>
-              <w:t>3</w:t>
+              <w:t>1</w:t>
             </w:r>
           </w:p>
         </w:tc>
@@ -1315,7 +1315,7 @@
               <w:jc w:val="center"/>
             </w:pPr>
             <w:r>
-              <w:t>0</w:t>
+              <w:t>1</w:t>
             </w:r>
           </w:p>
         </w:tc>
@@ -1341,7 +1341,7 @@
               <w:jc w:val="center"/>
             </w:pPr>
             <w:r>
-              <w:t>1</w:t>
+              <w:t>0</w:t>
             </w:r>
           </w:p>
         </w:tc>
@@ -1516,7 +1516,7 @@
               <w:jc w:val="center"/>
             </w:pPr>
             <w:r>
-              <w:t>1</w:t>
+              <w:t>0</w:t>
             </w:r>
           </w:p>
         </w:tc>
@@ -1542,7 +1542,7 @@
               <w:jc w:val="center"/>
             </w:pPr>
             <w:r>
-              <w:t>0</w:t>
+              <w:t>1</w:t>
             </w:r>
           </w:p>
         </w:tc>
@@ -1570,7 +1570,7 @@
               <w:jc w:val="center"/>
             </w:pPr>
             <w:r>
-              <w:t>Database</w:t>
+              <w:t>SW Version</w:t>
             </w:r>
           </w:p>
         </w:tc>
@@ -1583,208 +1583,7 @@
               <w:jc w:val="center"/>
             </w:pPr>
             <w:r>
-              <w:t>0</w:t>
-            </w:r>
-          </w:p>
-        </w:tc>
-        <w:tc>
-          <w:tcPr>
-            <w:tcW w:type="dxa" w:w="1728"/>
-          </w:tcPr>
-          <w:p>
-            <w:pPr>
-              <w:jc w:val="center"/>
-            </w:pPr>
-            <w:r>
-              <w:t>0</w:t>
-            </w:r>
-          </w:p>
-        </w:tc>
-        <w:tc>
-          <w:tcPr>
-            <w:tcW w:type="dxa" w:w="1728"/>
-          </w:tcPr>
-          <w:p>
-            <w:pPr>
-              <w:jc w:val="center"/>
-            </w:pPr>
-            <w:r>
-              <w:t>2</w:t>
-            </w:r>
-          </w:p>
-        </w:tc>
-        <w:tc>
-          <w:tcPr>
-            <w:tcW w:type="dxa" w:w="1728"/>
-          </w:tcPr>
-          <w:p>
-            <w:pPr>
-              <w:jc w:val="center"/>
-            </w:pPr>
-            <w:r>
-              <w:t>0</w:t>
-            </w:r>
-          </w:p>
-        </w:tc>
-      </w:tr>
-      <w:tr>
-        <w:tc>
-          <w:tcPr>
-            <w:tcW w:type="dxa" w:w="1728"/>
-          </w:tcPr>
-          <w:p>
-            <w:pPr>
-              <w:jc w:val="center"/>
-            </w:pPr>
-            <w:r>
-              <w:t>SW Version</w:t>
-            </w:r>
-          </w:p>
-        </w:tc>
-        <w:tc>
-          <w:tcPr>
-            <w:tcW w:type="dxa" w:w="1728"/>
-          </w:tcPr>
-          <w:p>
-            <w:pPr>
-              <w:jc w:val="center"/>
-            </w:pPr>
-            <w:r>
               <w:t>3</w:t>
-            </w:r>
-          </w:p>
-        </w:tc>
-        <w:tc>
-          <w:tcPr>
-            <w:tcW w:type="dxa" w:w="1728"/>
-          </w:tcPr>
-          <w:p>
-            <w:pPr>
-              <w:jc w:val="center"/>
-            </w:pPr>
-            <w:r>
-              <w:t>0</w:t>
-            </w:r>
-          </w:p>
-        </w:tc>
-        <w:tc>
-          <w:tcPr>
-            <w:tcW w:type="dxa" w:w="1728"/>
-          </w:tcPr>
-          <w:p>
-            <w:pPr>
-              <w:jc w:val="center"/>
-            </w:pPr>
-            <w:r>
-              <w:t>0</w:t>
-            </w:r>
-          </w:p>
-        </w:tc>
-        <w:tc>
-          <w:tcPr>
-            <w:tcW w:type="dxa" w:w="1728"/>
-          </w:tcPr>
-          <w:p>
-            <w:pPr>
-              <w:jc w:val="center"/>
-            </w:pPr>
-            <w:r>
-              <w:t>0</w:t>
-            </w:r>
-          </w:p>
-        </w:tc>
-      </w:tr>
-      <w:tr>
-        <w:tc>
-          <w:tcPr>
-            <w:tcW w:type="dxa" w:w="1728"/>
-          </w:tcPr>
-          <w:p>
-            <w:pPr>
-              <w:jc w:val="center"/>
-            </w:pPr>
-            <w:r>
-              <w:t>Storage</w:t>
-            </w:r>
-          </w:p>
-        </w:tc>
-        <w:tc>
-          <w:tcPr>
-            <w:tcW w:type="dxa" w:w="1728"/>
-          </w:tcPr>
-          <w:p>
-            <w:pPr>
-              <w:jc w:val="center"/>
-            </w:pPr>
-            <w:r>
-              <w:t>0</w:t>
-            </w:r>
-          </w:p>
-        </w:tc>
-        <w:tc>
-          <w:tcPr>
-            <w:tcW w:type="dxa" w:w="1728"/>
-          </w:tcPr>
-          <w:p>
-            <w:pPr>
-              <w:jc w:val="center"/>
-            </w:pPr>
-            <w:r>
-              <w:t>0</w:t>
-            </w:r>
-          </w:p>
-        </w:tc>
-        <w:tc>
-          <w:tcPr>
-            <w:tcW w:type="dxa" w:w="1728"/>
-          </w:tcPr>
-          <w:p>
-            <w:pPr>
-              <w:jc w:val="center"/>
-            </w:pPr>
-            <w:r>
-              <w:t>2</w:t>
-            </w:r>
-          </w:p>
-        </w:tc>
-        <w:tc>
-          <w:tcPr>
-            <w:tcW w:type="dxa" w:w="1728"/>
-          </w:tcPr>
-          <w:p>
-            <w:pPr>
-              <w:jc w:val="center"/>
-            </w:pPr>
-            <w:r>
-              <w:t>0</w:t>
-            </w:r>
-          </w:p>
-        </w:tc>
-      </w:tr>
-      <w:tr>
-        <w:tc>
-          <w:tcPr>
-            <w:tcW w:type="dxa" w:w="1728"/>
-          </w:tcPr>
-          <w:p>
-            <w:pPr>
-              <w:jc w:val="center"/>
-            </w:pPr>
-            <w:r>
-              <w:t>Bastion</w:t>
-            </w:r>
-          </w:p>
-        </w:tc>
-        <w:tc>
-          <w:tcPr>
-            <w:tcW w:type="dxa" w:w="1728"/>
-          </w:tcPr>
-          <w:p>
-            <w:pPr>
-              <w:jc w:val="center"/>
-            </w:pPr>
-            <w:r>
-              <w:t>2</w:t>
             </w:r>
           </w:p>
         </w:tc>
@@ -1978,29 +1777,29 @@
             <w:r>
               <w:rPr>
                 <w:b/>
-                <w:color w:val="008000"/>
+                <w:color w:val="FF0000"/>
               </w:rPr>
-              <w:t>정상</w:t>
-            </w:r>
-          </w:p>
-        </w:tc>
-        <w:tc>
-          <w:tcPr>
-            <w:tcW w:type="dxa" w:w="1728"/>
-          </w:tcPr>
-          <w:p>
-            <w:r>
-              <w:t>TCP 80 Open</w:t>
-            </w:r>
-          </w:p>
-        </w:tc>
-        <w:tc>
-          <w:tcPr>
-            <w:tcW w:type="dxa" w:w="1728"/>
-          </w:tcPr>
-          <w:p>
-            <w:r>
-              <w:t>포트 응답 정상</w:t>
+              <w:t>위험</w:t>
+            </w:r>
+          </w:p>
+        </w:tc>
+        <w:tc>
+          <w:tcPr>
+            <w:tcW w:type="dxa" w:w="1728"/>
+          </w:tcPr>
+          <w:p>
+            <w:r>
+              <w:t>연결 실패</w:t>
+            </w:r>
+          </w:p>
+        </w:tc>
+        <w:tc>
+          <w:tcPr>
+            <w:tcW w:type="dxa" w:w="1728"/>
+          </w:tcPr>
+          <w:p>
+            <w:r>
+              <w:t>서비스 응답 없음</w:t>
             </w:r>
           </w:p>
         </w:tc>
@@ -2034,29 +1833,29 @@
             <w:r>
               <w:rPr>
                 <w:b/>
-                <w:color w:val="008000"/>
+                <w:color w:val="FF0000"/>
               </w:rPr>
-              <w:t>정상</w:t>
-            </w:r>
-          </w:p>
-        </w:tc>
-        <w:tc>
-          <w:tcPr>
-            <w:tcW w:type="dxa" w:w="1728"/>
-          </w:tcPr>
-          <w:p>
-            <w:r>
-              <w:t>200 OK</w:t>
-            </w:r>
-          </w:p>
-        </w:tc>
-        <w:tc>
-          <w:tcPr>
-            <w:tcW w:type="dxa" w:w="1728"/>
-          </w:tcPr>
-          <w:p>
-            <w:r>
-              <w:t>서비스 정상 응답</w:t>
+              <w:t>위험</w:t>
+            </w:r>
+          </w:p>
+        </w:tc>
+        <w:tc>
+          <w:tcPr>
+            <w:tcW w:type="dxa" w:w="1728"/>
+          </w:tcPr>
+          <w:p>
+            <w:r>
+              <w:t>연결 실패</w:t>
+            </w:r>
+          </w:p>
+        </w:tc>
+        <w:tc>
+          <w:tcPr>
+            <w:tcW w:type="dxa" w:w="1728"/>
+          </w:tcPr>
+          <w:p>
+            <w:r>
+              <w:t>서비스 응답 없음</w:t>
             </w:r>
           </w:p>
         </w:tc>
@@ -2090,29 +1889,29 @@
             <w:r>
               <w:rPr>
                 <w:b/>
-                <w:color w:val="008000"/>
+                <w:color w:val="FF0000"/>
               </w:rPr>
-              <w:t>정상</w:t>
-            </w:r>
-          </w:p>
-        </w:tc>
-        <w:tc>
-          <w:tcPr>
-            <w:tcW w:type="dxa" w:w="1728"/>
-          </w:tcPr>
-          <w:p>
-            <w:r>
-              <w:t>200 OK</w:t>
-            </w:r>
-          </w:p>
-        </w:tc>
-        <w:tc>
-          <w:tcPr>
-            <w:tcW w:type="dxa" w:w="1728"/>
-          </w:tcPr>
-          <w:p>
-            <w:r>
-              <w:t>서비스 정상 응답</w:t>
+              <w:t>위험</w:t>
+            </w:r>
+          </w:p>
+        </w:tc>
+        <w:tc>
+          <w:tcPr>
+            <w:tcW w:type="dxa" w:w="1728"/>
+          </w:tcPr>
+          <w:p>
+            <w:r>
+              <w:t>연결 실패</w:t>
+            </w:r>
+          </w:p>
+        </w:tc>
+        <w:tc>
+          <w:tcPr>
+            <w:tcW w:type="dxa" w:w="1728"/>
+          </w:tcPr>
+          <w:p>
+            <w:r>
+              <w:t>서비스 응답 없음</w:t>
             </w:r>
           </w:p>
         </w:tc>
@@ -2146,29 +1945,29 @@
             <w:r>
               <w:rPr>
                 <w:b/>
-                <w:color w:val="008000"/>
+                <w:color w:val="FF0000"/>
               </w:rPr>
-              <w:t>정상</w:t>
-            </w:r>
-          </w:p>
-        </w:tc>
-        <w:tc>
-          <w:tcPr>
-            <w:tcW w:type="dxa" w:w="1728"/>
-          </w:tcPr>
-          <w:p>
-            <w:r>
-              <w:t>200 OK</w:t>
-            </w:r>
-          </w:p>
-        </w:tc>
-        <w:tc>
-          <w:tcPr>
-            <w:tcW w:type="dxa" w:w="1728"/>
-          </w:tcPr>
-          <w:p>
-            <w:r>
-              <w:t>서비스 정상 응답</w:t>
+              <w:t>위험</w:t>
+            </w:r>
+          </w:p>
+        </w:tc>
+        <w:tc>
+          <w:tcPr>
+            <w:tcW w:type="dxa" w:w="1728"/>
+          </w:tcPr>
+          <w:p>
+            <w:r>
+              <w:t>연결 실패</w:t>
+            </w:r>
+          </w:p>
+        </w:tc>
+        <w:tc>
+          <w:tcPr>
+            <w:tcW w:type="dxa" w:w="1728"/>
+          </w:tcPr>
+          <w:p>
+            <w:r>
+              <w:t>서비스 응답 없음</w:t>
             </w:r>
           </w:p>
         </w:tc>
@@ -2202,29 +2001,29 @@
             <w:r>
               <w:rPr>
                 <w:b/>
-                <w:color w:val="008000"/>
+                <w:color w:val="FF0000"/>
               </w:rPr>
-              <w:t>정상</w:t>
-            </w:r>
-          </w:p>
-        </w:tc>
-        <w:tc>
-          <w:tcPr>
-            <w:tcW w:type="dxa" w:w="1728"/>
-          </w:tcPr>
-          <w:p>
-            <w:r>
-              <w:t>200 OK</w:t>
-            </w:r>
-          </w:p>
-        </w:tc>
-        <w:tc>
-          <w:tcPr>
-            <w:tcW w:type="dxa" w:w="1728"/>
-          </w:tcPr>
-          <w:p>
-            <w:r>
-              <w:t>서비스 정상 응답</w:t>
+              <w:t>위험</w:t>
+            </w:r>
+          </w:p>
+        </w:tc>
+        <w:tc>
+          <w:tcPr>
+            <w:tcW w:type="dxa" w:w="1728"/>
+          </w:tcPr>
+          <w:p>
+            <w:r>
+              <w:t>연결 실패</w:t>
+            </w:r>
+          </w:p>
+        </w:tc>
+        <w:tc>
+          <w:tcPr>
+            <w:tcW w:type="dxa" w:w="1728"/>
+          </w:tcPr>
+          <w:p>
+            <w:r>
+              <w:t>서비스 응답 없음</w:t>
             </w:r>
           </w:p>
         </w:tc>
@@ -2258,29 +2057,29 @@
             <w:r>
               <w:rPr>
                 <w:b/>
-                <w:color w:val="008000"/>
+                <w:color w:val="FF0000"/>
               </w:rPr>
-              <w:t>정상</w:t>
-            </w:r>
-          </w:p>
-        </w:tc>
-        <w:tc>
-          <w:tcPr>
-            <w:tcW w:type="dxa" w:w="1728"/>
-          </w:tcPr>
-          <w:p>
-            <w:r>
-              <w:t>200 OK</w:t>
-            </w:r>
-          </w:p>
-        </w:tc>
-        <w:tc>
-          <w:tcPr>
-            <w:tcW w:type="dxa" w:w="1728"/>
-          </w:tcPr>
-          <w:p>
-            <w:r>
-              <w:t>서비스 정상 응답</w:t>
+              <w:t>위험</w:t>
+            </w:r>
+          </w:p>
+        </w:tc>
+        <w:tc>
+          <w:tcPr>
+            <w:tcW w:type="dxa" w:w="1728"/>
+          </w:tcPr>
+          <w:p>
+            <w:r>
+              <w:t>연결 실패</w:t>
+            </w:r>
+          </w:p>
+        </w:tc>
+        <w:tc>
+          <w:tcPr>
+            <w:tcW w:type="dxa" w:w="1728"/>
+          </w:tcPr>
+          <w:p>
+            <w:r>
+              <w:t>서비스 응답 없음</w:t>
             </w:r>
           </w:p>
         </w:tc>
@@ -2427,28 +2226,29 @@
             <w:r>
               <w:rPr>
                 <w:b/>
+                <w:color w:val="008000"/>
               </w:rPr>
-              <w:t>확인불가</w:t>
-            </w:r>
-          </w:p>
-        </w:tc>
-        <w:tc>
-          <w:tcPr>
-            <w:tcW w:type="dxa" w:w="1728"/>
-          </w:tcPr>
-          <w:p>
-            <w:r>
-              <w:t>N/A</w:t>
-            </w:r>
-          </w:p>
-        </w:tc>
-        <w:tc>
-          <w:tcPr>
-            <w:tcW w:type="dxa" w:w="1728"/>
-          </w:tcPr>
-          <w:p>
-            <w:r>
-              <w:t>연결 실패</w:t>
+              <w:t>정상</w:t>
+            </w:r>
+          </w:p>
+        </w:tc>
+        <w:tc>
+          <w:tcPr>
+            <w:tcW w:type="dxa" w:w="1728"/>
+          </w:tcPr>
+          <w:p>
+            <w:r>
+              <w:t>May 14 18:57:50 2026 GMT</w:t>
+            </w:r>
+          </w:p>
+        </w:tc>
+        <w:tc>
+          <w:tcPr>
+            <w:tcW w:type="dxa" w:w="1728"/>
+          </w:tcPr>
+          <w:p>
+            <w:r>
+              <w:t>정상 (77일 남음)</w:t>
             </w:r>
           </w:p>
         </w:tc>
@@ -2460,7 +2260,7 @@
         <w:pStyle w:val="Heading2"/>
       </w:pPr>
       <w:r>
-        <w:t>4.3 DEV 환경</w:t>
+        <w:t>4.3 GPU 환경</w:t>
       </w:r>
     </w:p>
     <w:p>
@@ -2468,7 +2268,7 @@
         <w:pStyle w:val="Heading3"/>
       </w:pPr>
       <w:r>
-        <w:t>DEV Master</w:t>
+        <w:t>GPU Master</w:t>
       </w:r>
     </w:p>
     <w:tbl>
@@ -2607,7 +2407,7 @@
           </w:tcPr>
           <w:p>
             <w:r>
-              <w:t>13</w:t>
+              <w:t>53</w:t>
             </w:r>
           </w:p>
         </w:tc>
@@ -2663,7 +2463,7 @@
           </w:tcPr>
           <w:p>
             <w:r>
-              <w:t>44.3</w:t>
+              <w:t>23.8</w:t>
             </w:r>
           </w:p>
         </w:tc>
@@ -2719,7 +2519,7 @@
           </w:tcPr>
           <w:p>
             <w:r>
-              <w:t>9</w:t>
+              <w:t>1</w:t>
             </w:r>
           </w:p>
         </w:tc>
@@ -2775,7 +2575,7 @@
           </w:tcPr>
           <w:p>
             <w:r>
-              <w:t>up 6 weeks, 4 days, 49 minutes</w:t>
+              <w:t>up 5 weeks, 3 days, 3 hours, 3...</w:t>
             </w:r>
           </w:p>
         </w:tc>
@@ -2887,7 +2687,7 @@
           </w:tcPr>
           <w:p>
             <w:r>
-              <w:t>0.19</w:t>
+              <w:t>0.59</w:t>
             </w:r>
           </w:p>
         </w:tc>
@@ -2943,7 +2743,7 @@
           </w:tcPr>
           <w:p>
             <w:r>
-              <w:t>3840</w:t>
+              <w:t>2784</w:t>
             </w:r>
           </w:p>
         </w:tc>
@@ -2999,7 +2799,7 @@
           </w:tcPr>
           <w:p>
             <w:r>
-              <w:t>559</w:t>
+              <w:t>1145</w:t>
             </w:r>
           </w:p>
         </w:tc>
@@ -3055,7 +2855,7 @@
           </w:tcPr>
           <w:p>
             <w:r>
-              <w:t>5.14.0-570.17.1.el9_6.x86_64</w:t>
+              <w:t>5.14.0-611.16.1.el9_7.x86_64</w:t>
             </w:r>
           </w:p>
         </w:tc>
@@ -3111,7 +2911,7 @@
           </w:tcPr>
           <w:p>
             <w:r>
-              <w:t>13</w:t>
+              <w:t>60</w:t>
             </w:r>
           </w:p>
         </w:tc>
@@ -3167,7 +2967,7 @@
           </w:tcPr>
           <w:p>
             <w:r>
-              <w:t>44.0</w:t>
+              <w:t>24.0</w:t>
             </w:r>
           </w:p>
         </w:tc>
@@ -3223,7 +3023,7 @@
           </w:tcPr>
           <w:p>
             <w:r>
-              <w:t>7</w:t>
+              <w:t>2</w:t>
             </w:r>
           </w:p>
         </w:tc>
@@ -3279,7 +3079,7 @@
           </w:tcPr>
           <w:p>
             <w:r>
-              <w:t>up 6 weeks, 4 days, 49 minutes</w:t>
+              <w:t>up 5 weeks, 3 days, 4 hours, 3...</w:t>
             </w:r>
           </w:p>
         </w:tc>
@@ -3391,7 +3191,7 @@
           </w:tcPr>
           <w:p>
             <w:r>
-              <w:t>0.00</w:t>
+              <w:t>0.86</w:t>
             </w:r>
           </w:p>
         </w:tc>
@@ -3447,7 +3247,7 @@
           </w:tcPr>
           <w:p>
             <w:r>
-              <w:t>3904</w:t>
+              <w:t>2688</w:t>
             </w:r>
           </w:p>
         </w:tc>
@@ -3503,7 +3303,7 @@
           </w:tcPr>
           <w:p>
             <w:r>
-              <w:t>577</w:t>
+              <w:t>1145</w:t>
             </w:r>
           </w:p>
         </w:tc>
@@ -3559,7 +3359,7 @@
           </w:tcPr>
           <w:p>
             <w:r>
-              <w:t>5.14.0-570.17.1.el9_6.x86_64</w:t>
+              <w:t>5.14.0-611.16.1.el9_7.x86_64</w:t>
             </w:r>
           </w:p>
         </w:tc>
@@ -3615,7 +3415,7 @@
           </w:tcPr>
           <w:p>
             <w:r>
-              <w:t>13</w:t>
+              <w:t>58</w:t>
             </w:r>
           </w:p>
         </w:tc>
@@ -3671,7 +3471,7 @@
           </w:tcPr>
           <w:p>
             <w:r>
-              <w:t>44.4</w:t>
+              <w:t>26.7</w:t>
             </w:r>
           </w:p>
         </w:tc>
@@ -3727,7 +3527,7 @@
           </w:tcPr>
           <w:p>
             <w:r>
-              <w:t>12</w:t>
+              <w:t>2</w:t>
             </w:r>
           </w:p>
         </w:tc>
@@ -3783,7 +3583,7 @@
           </w:tcPr>
           <w:p>
             <w:r>
-              <w:t>up 6 weeks, 4 days, 49 minutes</w:t>
+              <w:t>up 5 weeks, 3 days, 3 hours, 4...</w:t>
             </w:r>
           </w:p>
         </w:tc>
@@ -3895,7 +3695,7 @@
           </w:tcPr>
           <w:p>
             <w:r>
-              <w:t>0.17</w:t>
+              <w:t>0.39</w:t>
             </w:r>
           </w:p>
         </w:tc>
@@ -3951,7 +3751,7 @@
           </w:tcPr>
           <w:p>
             <w:r>
-              <w:t>3968</w:t>
+              <w:t>2880</w:t>
             </w:r>
           </w:p>
         </w:tc>
@@ -4007,7 +3807,7 @@
           </w:tcPr>
           <w:p>
             <w:r>
-              <w:t>542</w:t>
+              <w:t>1215</w:t>
             </w:r>
           </w:p>
         </w:tc>
@@ -4063,7 +3863,7 @@
           </w:tcPr>
           <w:p>
             <w:r>
-              <w:t>5.14.0-570.17.1.el9_6.x86_64</w:t>
+              <w:t>5.14.0-611.16.1.el9_7.x86_64</w:t>
             </w:r>
           </w:p>
         </w:tc>
@@ -4085,7 +3885,7 @@
         <w:pStyle w:val="Heading3"/>
       </w:pPr>
       <w:r>
-        <w:t>DEV Worker</w:t>
+        <w:t>GPU Worker</w:t>
       </w:r>
     </w:p>
     <w:tbl>
@@ -4224,7 +4024,7 @@
           </w:tcPr>
           <w:p>
             <w:r>
-              <w:t>16</w:t>
+              <w:t>66</w:t>
             </w:r>
           </w:p>
         </w:tc>
@@ -4280,7 +4080,7 @@
           </w:tcPr>
           <w:p>
             <w:r>
-              <w:t>13.2</w:t>
+              <w:t>47.0</w:t>
             </w:r>
           </w:p>
         </w:tc>
@@ -4336,7 +4136,7 @@
           </w:tcPr>
           <w:p>
             <w:r>
-              <w:t>2</w:t>
+              <w:t>9</w:t>
             </w:r>
           </w:p>
         </w:tc>
@@ -4392,7 +4192,7 @@
           </w:tcPr>
           <w:p>
             <w:r>
-              <w:t>up 6 weeks, 4 days, 49 minutes</w:t>
+              <w:t>up 1 week, 3 hours, 40 minutes</w:t>
             </w:r>
           </w:p>
         </w:tc>
@@ -4504,7 +4304,7 @@
           </w:tcPr>
           <w:p>
             <w:r>
-              <w:t>0.16</w:t>
+              <w:t>4.46</w:t>
             </w:r>
           </w:p>
         </w:tc>
@@ -4560,7 +4360,7 @@
           </w:tcPr>
           <w:p>
             <w:r>
-              <w:t>3552</w:t>
+              <w:t>13216</w:t>
             </w:r>
           </w:p>
         </w:tc>
@@ -4616,7 +4416,7 @@
           </w:tcPr>
           <w:p>
             <w:r>
-              <w:t>40</w:t>
+              <w:t>45</w:t>
             </w:r>
           </w:p>
         </w:tc>
@@ -4672,7 +4472,7 @@
           </w:tcPr>
           <w:p>
             <w:r>
-              <w:t>5.14.0-570.17.1.el9_6.x86_64</w:t>
+              <w:t>5.14.0-611.16.1.el9_7.x86_64</w:t>
             </w:r>
           </w:p>
         </w:tc>
@@ -4728,7 +4528,7 @@
           </w:tcPr>
           <w:p>
             <w:r>
-              <w:t>14</w:t>
+              <w:t>63</w:t>
             </w:r>
           </w:p>
         </w:tc>
@@ -4784,7 +4584,7 @@
           </w:tcPr>
           <w:p>
             <w:r>
-              <w:t>13.9</w:t>
+              <w:t>17.9</w:t>
             </w:r>
           </w:p>
         </w:tc>
@@ -4840,7 +4640,7 @@
           </w:tcPr>
           <w:p>
             <w:r>
-              <w:t>2</w:t>
+              <w:t>1</w:t>
             </w:r>
           </w:p>
         </w:tc>
@@ -4896,7 +4696,7 @@
           </w:tcPr>
           <w:p>
             <w:r>
-              <w:t>up 6 weeks, 4 days, 49 minutes</w:t>
+              <w:t>up 2 days, 5 hours, 6 minutes</w:t>
             </w:r>
           </w:p>
         </w:tc>
@@ -5008,7 +4808,7 @@
           </w:tcPr>
           <w:p>
             <w:r>
-              <w:t>0.03</w:t>
+              <w:t>1.85</w:t>
             </w:r>
           </w:p>
         </w:tc>
@@ -5064,7 +4864,7 @@
           </w:tcPr>
           <w:p>
             <w:r>
-              <w:t>3776</w:t>
+              <w:t>2944</w:t>
             </w:r>
           </w:p>
         </w:tc>
@@ -5120,7 +4920,7 @@
           </w:tcPr>
           <w:p>
             <w:r>
-              <w:t>37</w:t>
+              <w:t>35</w:t>
             </w:r>
           </w:p>
         </w:tc>
@@ -5176,7 +4976,7 @@
           </w:tcPr>
           <w:p>
             <w:r>
-              <w:t>5.14.0-570.17.1.el9_6.x86_64</w:t>
+              <w:t>5.14.0-611.16.1.el9_7.x86_64</w:t>
             </w:r>
           </w:p>
         </w:tc>
@@ -5232,7 +5032,7 @@
           </w:tcPr>
           <w:p>
             <w:r>
-              <w:t>16</w:t>
+              <w:t>59</w:t>
             </w:r>
           </w:p>
         </w:tc>
@@ -5288,7 +5088,7 @@
           </w:tcPr>
           <w:p>
             <w:r>
-              <w:t>16.5</w:t>
+              <w:t>37.5</w:t>
             </w:r>
           </w:p>
         </w:tc>
@@ -5344,7 +5144,7 @@
           </w:tcPr>
           <w:p>
             <w:r>
-              <w:t>2</w:t>
+              <w:t>9</w:t>
             </w:r>
           </w:p>
         </w:tc>
@@ -5400,7 +5200,7 @@
           </w:tcPr>
           <w:p>
             <w:r>
-              <w:t>up 6 weeks, 4 days, 49 minutes</w:t>
+              <w:t>up 1 week, 3 hours, 43 minutes</w:t>
             </w:r>
           </w:p>
         </w:tc>
@@ -5512,7 +5312,7 @@
           </w:tcPr>
           <w:p>
             <w:r>
-              <w:t>0.11</w:t>
+              <w:t>4.90</w:t>
             </w:r>
           </w:p>
         </w:tc>
@@ -5568,7 +5368,7 @@
           </w:tcPr>
           <w:p>
             <w:r>
-              <w:t>3776</w:t>
+              <w:t>6176</w:t>
             </w:r>
           </w:p>
         </w:tc>
@@ -5624,7 +5424,7 @@
           </w:tcPr>
           <w:p>
             <w:r>
-              <w:t>43</w:t>
+              <w:t>45</w:t>
             </w:r>
           </w:p>
         </w:tc>
@@ -5680,7 +5480,7 @@
           </w:tcPr>
           <w:p>
             <w:r>
-              <w:t>5.14.0-570.17.1.el9_6.x86_64</w:t>
+              <w:t>5.14.0-611.16.1.el9_7.x86_64</w:t>
             </w:r>
           </w:p>
         </w:tc>
@@ -5841,21 +5641,19 @@
           </w:tcPr>
           <w:p>
             <w:r>
-              <w:t>master1:Ready</w:t>
+              <w:t>gpu-master-01:Ready</w:t>
               <w:br/>
-              <w:t>master2:Ready</w:t>
-              <w:br/>
-              <w:t>ma...</w:t>
-            </w:r>
-          </w:p>
-        </w:tc>
-        <w:tc>
-          <w:tcPr>
-            <w:tcW w:type="dxa" w:w="1728"/>
-          </w:tcPr>
-          <w:p>
-            <w:r>
-              <w:t>모두 정상 (6/6)</w:t>
+              <w:t>gpu-master...</w:t>
+            </w:r>
+          </w:p>
+        </w:tc>
+        <w:tc>
+          <w:tcPr>
+            <w:tcW w:type="dxa" w:w="1728"/>
+          </w:tcPr>
+          <w:p>
+            <w:r>
+              <w:t>모두 정상 (7/7)</w:t>
             </w:r>
           </w:p>
         </w:tc>
@@ -5901,13 +5699,9 @@
           </w:tcPr>
           <w:p>
             <w:r>
-              <w:t>master1:6</w:t>
+              <w:t>gpu-master-01:6</w:t>
               <w:br/>
-              <w:t>master2:4</w:t>
-              <w:br/>
-              <w:t>master3:5</w:t>
-              <w:br/>
-              <w:t>...</w:t>
+              <w:t>gpu-master-02:...</w:t>
             </w:r>
           </w:p>
         </w:tc>
@@ -5963,11 +5757,9 @@
           </w:tcPr>
           <w:p>
             <w:r>
-              <w:t>master1:37</w:t>
+              <w:t>gpu-master-01:28</w:t>
               <w:br/>
-              <w:t>master2:37</w:t>
-              <w:br/>
-              <w:t>master3:...</w:t>
+              <w:t>gpu-master-02...</w:t>
             </w:r>
           </w:p>
         </w:tc>
@@ -6023,19 +5815,17 @@
           </w:tcPr>
           <w:p>
             <w:r>
-              <w:t>cilium-2ngbl:Running</w:t>
-              <w:br/>
-              <w:t>cilium-dh...</w:t>
-            </w:r>
-          </w:p>
-        </w:tc>
-        <w:tc>
-          <w:tcPr>
-            <w:tcW w:type="dxa" w:w="1728"/>
-          </w:tcPr>
-          <w:p>
-            <w:r>
-              <w:t>모두 정상 (30/30)</w:t>
+              <w:t>calico-kube-controllers-85d774...</w:t>
+            </w:r>
+          </w:p>
+        </w:tc>
+        <w:tc>
+          <w:tcPr>
+            <w:tcW w:type="dxa" w:w="1728"/>
+          </w:tcPr>
+          <w:p>
+            <w:r>
+              <w:t>모두 정상 (32/32)</w:t>
             </w:r>
           </w:p>
         </w:tc>
@@ -6058,6 +5848,62 @@
           <w:p>
             <w:r>
               <w:t>Warning 이벤트</w:t>
+            </w:r>
+          </w:p>
+        </w:tc>
+        <w:tc>
+          <w:tcPr>
+            <w:tcW w:type="dxa" w:w="1728"/>
+          </w:tcPr>
+          <w:p>
+            <w:r>
+              <w:rPr>
+                <w:b/>
+                <w:color w:val="FF0000"/>
+              </w:rPr>
+              <w:t>위험</w:t>
+            </w:r>
+          </w:p>
+        </w:tc>
+        <w:tc>
+          <w:tcPr>
+            <w:tcW w:type="dxa" w:w="1728"/>
+          </w:tcPr>
+          <w:p>
+            <w:r>
+              <w:t>64</w:t>
+            </w:r>
+          </w:p>
+        </w:tc>
+        <w:tc>
+          <w:tcPr>
+            <w:tcW w:type="dxa" w:w="1728"/>
+          </w:tcPr>
+          <w:p>
+            <w:r>
+              <w:t>임계치 초과 (64개 / 50개)</w:t>
+            </w:r>
+          </w:p>
+        </w:tc>
+      </w:tr>
+      <w:tr>
+        <w:tc>
+          <w:tcPr>
+            <w:tcW w:type="dxa" w:w="1728"/>
+          </w:tcPr>
+          <w:p>
+            <w:r>
+              <w:t>K8S-006</w:t>
+            </w:r>
+          </w:p>
+        </w:tc>
+        <w:tc>
+          <w:tcPr>
+            <w:tcW w:type="dxa" w:w="1728"/>
+          </w:tcPr>
+          <w:p>
+            <w:r>
+              <w:t>NotReady 노드</w:t>
             </w:r>
           </w:p>
         </w:tc>
@@ -6081,62 +5927,6 @@
           </w:tcPr>
           <w:p>
             <w:r>
-              <w:t>6</w:t>
-            </w:r>
-          </w:p>
-        </w:tc>
-        <w:tc>
-          <w:tcPr>
-            <w:tcW w:type="dxa" w:w="1728"/>
-          </w:tcPr>
-          <w:p>
-            <w:r>
-              <w:t>정상 범위</w:t>
-            </w:r>
-          </w:p>
-        </w:tc>
-      </w:tr>
-      <w:tr>
-        <w:tc>
-          <w:tcPr>
-            <w:tcW w:type="dxa" w:w="1728"/>
-          </w:tcPr>
-          <w:p>
-            <w:r>
-              <w:t>K8S-006</w:t>
-            </w:r>
-          </w:p>
-        </w:tc>
-        <w:tc>
-          <w:tcPr>
-            <w:tcW w:type="dxa" w:w="1728"/>
-          </w:tcPr>
-          <w:p>
-            <w:r>
-              <w:t>NotReady 노드</w:t>
-            </w:r>
-          </w:p>
-        </w:tc>
-        <w:tc>
-          <w:tcPr>
-            <w:tcW w:type="dxa" w:w="1728"/>
-          </w:tcPr>
-          <w:p>
-            <w:r>
-              <w:rPr>
-                <w:b/>
-                <w:color w:val="008000"/>
-              </w:rPr>
-              <w:t>정상</w:t>
-            </w:r>
-          </w:p>
-        </w:tc>
-        <w:tc>
-          <w:tcPr>
-            <w:tcW w:type="dxa" w:w="1728"/>
-          </w:tcPr>
-          <w:p>
-            <w:r>
               <w:t>0</w:t>
               <w:br/>
               <w:t>0</w:t>
@@ -6150,62 +5940,6 @@
           <w:p>
             <w:r>
               <w:t>정상</w:t>
-            </w:r>
-          </w:p>
-        </w:tc>
-      </w:tr>
-      <w:tr>
-        <w:tc>
-          <w:tcPr>
-            <w:tcW w:type="dxa" w:w="1728"/>
-          </w:tcPr>
-          <w:p>
-            <w:r>
-              <w:t>K8S-007</w:t>
-            </w:r>
-          </w:p>
-        </w:tc>
-        <w:tc>
-          <w:tcPr>
-            <w:tcW w:type="dxa" w:w="1728"/>
-          </w:tcPr>
-          <w:p>
-            <w:r>
-              <w:t>클러스터 버전</w:t>
-            </w:r>
-          </w:p>
-        </w:tc>
-        <w:tc>
-          <w:tcPr>
-            <w:tcW w:type="dxa" w:w="1728"/>
-          </w:tcPr>
-          <w:p>
-            <w:r>
-              <w:rPr>
-                <w:b/>
-                <w:color w:val="008000"/>
-              </w:rPr>
-              <w:t>정상</w:t>
-            </w:r>
-          </w:p>
-        </w:tc>
-        <w:tc>
-          <w:tcPr>
-            <w:tcW w:type="dxa" w:w="1728"/>
-          </w:tcPr>
-          <w:p>
-            <w:r>
-              <w:t>N/A</w:t>
-            </w:r>
-          </w:p>
-        </w:tc>
-        <w:tc>
-          <w:tcPr>
-            <w:tcW w:type="dxa" w:w="1728"/>
-          </w:tcPr>
-          <w:p>
-            <w:r>
-              <w:t>정보 수집 완료</w:t>
             </w:r>
           </w:p>
         </w:tc>
@@ -6400,29 +6134,29 @@
             <w:r>
               <w:rPr>
                 <w:b/>
-                <w:color w:val="008000"/>
+                <w:color w:val="FFA500"/>
               </w:rPr>
-              <w:t>정상</w:t>
-            </w:r>
-          </w:p>
-        </w:tc>
-        <w:tc>
-          <w:tcPr>
-            <w:tcW w:type="dxa" w:w="1728"/>
-          </w:tcPr>
-          <w:p>
-            <w:r>
-              <w:t>모두 정상</w:t>
-            </w:r>
-          </w:p>
-        </w:tc>
-        <w:tc>
-          <w:tcPr>
-            <w:tcW w:type="dxa" w:w="1728"/>
-          </w:tcPr>
-          <w:p>
-            <w:r>
-              <w:t>모든 리소스 정상</w:t>
+              <w:t>경고</w:t>
+            </w:r>
+          </w:p>
+        </w:tc>
+        <w:tc>
+          <w:tcPr>
+            <w:tcW w:type="dxa" w:w="1728"/>
+          </w:tcPr>
+          <w:p>
+            <w:r>
+              <w:t>vault:0/1</w:t>
+            </w:r>
+          </w:p>
+        </w:tc>
+        <w:tc>
+          <w:tcPr>
+            <w:tcW w:type="dxa" w:w="1728"/>
+          </w:tcPr>
+          <w:p>
+            <w:r>
+              <w:t>불일치 리소스 1개</w:t>
             </w:r>
           </w:p>
         </w:tc>
@@ -6512,29 +6246,29 @@
             <w:r>
               <w:rPr>
                 <w:b/>
-                <w:color w:val="008000"/>
+                <w:color w:val="FFA500"/>
               </w:rPr>
-              <w:t>정상</w:t>
-            </w:r>
-          </w:p>
-        </w:tc>
-        <w:tc>
-          <w:tcPr>
-            <w:tcW w:type="dxa" w:w="1728"/>
-          </w:tcPr>
-          <w:p>
-            <w:r>
-              <w:t>0</w:t>
-            </w:r>
-          </w:p>
-        </w:tc>
-        <w:tc>
-          <w:tcPr>
-            <w:tcW w:type="dxa" w:w="1728"/>
-          </w:tcPr>
-          <w:p>
-            <w:r>
-              <w:t>정상</w:t>
+              <w:t>경고</w:t>
+            </w:r>
+          </w:p>
+        </w:tc>
+        <w:tc>
+          <w:tcPr>
+            <w:tcW w:type="dxa" w:w="1728"/>
+          </w:tcPr>
+          <w:p>
+            <w:r>
+              <w:t>1</w:t>
+            </w:r>
+          </w:p>
+        </w:tc>
+        <w:tc>
+          <w:tcPr>
+            <w:tcW w:type="dxa" w:w="1728"/>
+          </w:tcPr>
+          <w:p>
+            <w:r>
+              <w:t>주의 필요 (1.0개)</w:t>
             </w:r>
           </w:p>
         </w:tc>
@@ -6580,7 +6314,7 @@
           </w:tcPr>
           <w:p>
             <w:r>
-              <w:t>8</w:t>
+              <w:t>17</w:t>
             </w:r>
           </w:p>
         </w:tc>
@@ -7009,29 +6743,29 @@
             <w:r>
               <w:rPr>
                 <w:b/>
-                <w:color w:val="FF0000"/>
+                <w:color w:val="008000"/>
               </w:rPr>
-              <w:t>위험</w:t>
-            </w:r>
-          </w:p>
-        </w:tc>
-        <w:tc>
-          <w:tcPr>
-            <w:tcW w:type="dxa" w:w="1728"/>
-          </w:tcPr>
-          <w:p>
-            <w:r>
-              <w:t>0</w:t>
-            </w:r>
-          </w:p>
-        </w:tc>
-        <w:tc>
-          <w:tcPr>
-            <w:tcW w:type="dxa" w:w="1728"/>
-          </w:tcPr>
-          <w:p>
-            <w:r>
-              <w:t>개수 부족 (현재 0/1)</w:t>
+              <w:t>정상</w:t>
+            </w:r>
+          </w:p>
+        </w:tc>
+        <w:tc>
+          <w:tcPr>
+            <w:tcW w:type="dxa" w:w="1728"/>
+          </w:tcPr>
+          <w:p>
+            <w:r>
+              <w:t>1</w:t>
+            </w:r>
+          </w:p>
+        </w:tc>
+        <w:tc>
+          <w:tcPr>
+            <w:tcW w:type="dxa" w:w="1728"/>
+          </w:tcPr>
+          <w:p>
+            <w:r>
+              <w:t>정상 (현재 1개)</w:t>
             </w:r>
           </w:p>
         </w:tc>
@@ -7170,29 +6904,29 @@
             <w:r>
               <w:rPr>
                 <w:b/>
-                <w:color w:val="FF0000"/>
+                <w:color w:val="008000"/>
               </w:rPr>
-              <w:t>위험</w:t>
-            </w:r>
-          </w:p>
-        </w:tc>
-        <w:tc>
-          <w:tcPr>
-            <w:tcW w:type="dxa" w:w="1728"/>
-          </w:tcPr>
-          <w:p>
-            <w:r>
-              <w:t>0</w:t>
-            </w:r>
-          </w:p>
-        </w:tc>
-        <w:tc>
-          <w:tcPr>
-            <w:tcW w:type="dxa" w:w="1728"/>
-          </w:tcPr>
-          <w:p>
-            <w:r>
-              <w:t>개수 부족 (현재 0/1)</w:t>
+              <w:t>정상</w:t>
+            </w:r>
+          </w:p>
+        </w:tc>
+        <w:tc>
+          <w:tcPr>
+            <w:tcW w:type="dxa" w:w="1728"/>
+          </w:tcPr>
+          <w:p>
+            <w:r>
+              <w:t>1</w:t>
+            </w:r>
+          </w:p>
+        </w:tc>
+        <w:tc>
+          <w:tcPr>
+            <w:tcW w:type="dxa" w:w="1728"/>
+          </w:tcPr>
+          <w:p>
+            <w:r>
+              <w:t>정상 (현재 1개)</w:t>
             </w:r>
           </w:p>
         </w:tc>
@@ -7226,29 +6960,29 @@
             <w:r>
               <w:rPr>
                 <w:b/>
-                <w:color w:val="FF0000"/>
+                <w:color w:val="008000"/>
               </w:rPr>
-              <w:t>위험</w:t>
-            </w:r>
-          </w:p>
-        </w:tc>
-        <w:tc>
-          <w:tcPr>
-            <w:tcW w:type="dxa" w:w="1728"/>
-          </w:tcPr>
-          <w:p>
-            <w:r>
-              <w:t>0</w:t>
-            </w:r>
-          </w:p>
-        </w:tc>
-        <w:tc>
-          <w:tcPr>
-            <w:tcW w:type="dxa" w:w="1728"/>
-          </w:tcPr>
-          <w:p>
-            <w:r>
-              <w:t>개수 부족 (현재 0/1)</w:t>
+              <w:t>정상</w:t>
+            </w:r>
+          </w:p>
+        </w:tc>
+        <w:tc>
+          <w:tcPr>
+            <w:tcW w:type="dxa" w:w="1728"/>
+          </w:tcPr>
+          <w:p>
+            <w:r>
+              <w:t>1</w:t>
+            </w:r>
+          </w:p>
+        </w:tc>
+        <w:tc>
+          <w:tcPr>
+            <w:tcW w:type="dxa" w:w="1728"/>
+          </w:tcPr>
+          <w:p>
+            <w:r>
+              <w:t>정상 (현재 1개)</w:t>
             </w:r>
           </w:p>
         </w:tc>
@@ -7387,29 +7121,29 @@
             <w:r>
               <w:rPr>
                 <w:b/>
-                <w:color w:val="FF0000"/>
+                <w:color w:val="008000"/>
               </w:rPr>
-              <w:t>위험</w:t>
-            </w:r>
-          </w:p>
-        </w:tc>
-        <w:tc>
-          <w:tcPr>
-            <w:tcW w:type="dxa" w:w="1728"/>
-          </w:tcPr>
-          <w:p>
-            <w:r>
-              <w:t>0</w:t>
-            </w:r>
-          </w:p>
-        </w:tc>
-        <w:tc>
-          <w:tcPr>
-            <w:tcW w:type="dxa" w:w="1728"/>
-          </w:tcPr>
-          <w:p>
-            <w:r>
-              <w:t>개수 부족 (현재 0/1)</w:t>
+              <w:t>정상</w:t>
+            </w:r>
+          </w:p>
+        </w:tc>
+        <w:tc>
+          <w:tcPr>
+            <w:tcW w:type="dxa" w:w="1728"/>
+          </w:tcPr>
+          <w:p>
+            <w:r>
+              <w:t>1</w:t>
+            </w:r>
+          </w:p>
+        </w:tc>
+        <w:tc>
+          <w:tcPr>
+            <w:tcW w:type="dxa" w:w="1728"/>
+          </w:tcPr>
+          <w:p>
+            <w:r>
+              <w:t>정상 (현재 1개)</w:t>
             </w:r>
           </w:p>
         </w:tc>
@@ -7604,29 +7338,29 @@
             <w:r>
               <w:rPr>
                 <w:b/>
-                <w:color w:val="FF0000"/>
+                <w:color w:val="008000"/>
               </w:rPr>
-              <w:t>위험</w:t>
-            </w:r>
-          </w:p>
-        </w:tc>
-        <w:tc>
-          <w:tcPr>
-            <w:tcW w:type="dxa" w:w="1728"/>
-          </w:tcPr>
-          <w:p>
-            <w:r>
-              <w:t>0</w:t>
-            </w:r>
-          </w:p>
-        </w:tc>
-        <w:tc>
-          <w:tcPr>
-            <w:tcW w:type="dxa" w:w="1728"/>
-          </w:tcPr>
-          <w:p>
-            <w:r>
-              <w:t>개수 부족 (현재 0/1)</w:t>
+              <w:t>정상</w:t>
+            </w:r>
+          </w:p>
+        </w:tc>
+        <w:tc>
+          <w:tcPr>
+            <w:tcW w:type="dxa" w:w="1728"/>
+          </w:tcPr>
+          <w:p>
+            <w:r>
+              <w:t>1</w:t>
+            </w:r>
+          </w:p>
+        </w:tc>
+        <w:tc>
+          <w:tcPr>
+            <w:tcW w:type="dxa" w:w="1728"/>
+          </w:tcPr>
+          <w:p>
+            <w:r>
+              <w:t>정상 (현재 1개)</w:t>
             </w:r>
           </w:p>
         </w:tc>
@@ -7660,29 +7394,29 @@
             <w:r>
               <w:rPr>
                 <w:b/>
-                <w:color w:val="FF0000"/>
+                <w:color w:val="008000"/>
               </w:rPr>
-              <w:t>위험</w:t>
-            </w:r>
-          </w:p>
-        </w:tc>
-        <w:tc>
-          <w:tcPr>
-            <w:tcW w:type="dxa" w:w="1728"/>
-          </w:tcPr>
-          <w:p>
-            <w:r>
-              <w:t>0</w:t>
-            </w:r>
-          </w:p>
-        </w:tc>
-        <w:tc>
-          <w:tcPr>
-            <w:tcW w:type="dxa" w:w="1728"/>
-          </w:tcPr>
-          <w:p>
-            <w:r>
-              <w:t>개수 부족 (현재 0/2)</w:t>
+              <w:t>정상</w:t>
+            </w:r>
+          </w:p>
+        </w:tc>
+        <w:tc>
+          <w:tcPr>
+            <w:tcW w:type="dxa" w:w="1728"/>
+          </w:tcPr>
+          <w:p>
+            <w:r>
+              <w:t>6</w:t>
+            </w:r>
+          </w:p>
+        </w:tc>
+        <w:tc>
+          <w:tcPr>
+            <w:tcW w:type="dxa" w:w="1728"/>
+          </w:tcPr>
+          <w:p>
+            <w:r>
+              <w:t>정상 (현재 6개)</w:t>
             </w:r>
           </w:p>
         </w:tc>
@@ -7821,29 +7555,29 @@
             <w:r>
               <w:rPr>
                 <w:b/>
-                <w:color w:val="FF0000"/>
+                <w:color w:val="008000"/>
               </w:rPr>
-              <w:t>위험</w:t>
-            </w:r>
-          </w:p>
-        </w:tc>
-        <w:tc>
-          <w:tcPr>
-            <w:tcW w:type="dxa" w:w="1728"/>
-          </w:tcPr>
-          <w:p>
-            <w:r>
-              <w:t>0</w:t>
-            </w:r>
-          </w:p>
-        </w:tc>
-        <w:tc>
-          <w:tcPr>
-            <w:tcW w:type="dxa" w:w="1728"/>
-          </w:tcPr>
-          <w:p>
-            <w:r>
-              <w:t>개수 부족 (현재 0/1)</w:t>
+              <w:t>정상</w:t>
+            </w:r>
+          </w:p>
+        </w:tc>
+        <w:tc>
+          <w:tcPr>
+            <w:tcW w:type="dxa" w:w="1728"/>
+          </w:tcPr>
+          <w:p>
+            <w:r>
+              <w:t>1</w:t>
+            </w:r>
+          </w:p>
+        </w:tc>
+        <w:tc>
+          <w:tcPr>
+            <w:tcW w:type="dxa" w:w="1728"/>
+          </w:tcPr>
+          <w:p>
+            <w:r>
+              <w:t>정상 (현재 1개)</w:t>
             </w:r>
           </w:p>
         </w:tc>
@@ -8304,167 +8038,6 @@
             <w:r>
               <w:rPr>
                 <w:b/>
-                <w:color w:val="008000"/>
-              </w:rPr>
-              <w:t>정상</w:t>
-            </w:r>
-          </w:p>
-        </w:tc>
-        <w:tc>
-          <w:tcPr>
-            <w:tcW w:type="dxa" w:w="1728"/>
-          </w:tcPr>
-          <w:p>
-            <w:r>
-              <w:t>6</w:t>
-            </w:r>
-          </w:p>
-        </w:tc>
-        <w:tc>
-          <w:tcPr>
-            <w:tcW w:type="dxa" w:w="1728"/>
-          </w:tcPr>
-          <w:p>
-            <w:r>
-              <w:t>정상 (현재 6개)</w:t>
-            </w:r>
-          </w:p>
-        </w:tc>
-      </w:tr>
-    </w:tbl>
-    <w:p/>
-    <w:p>
-      <w:pPr>
-        <w:pStyle w:val="Heading3"/>
-      </w:pPr>
-      <w:r>
-        <w:t>Database</w:t>
-      </w:r>
-    </w:p>
-    <w:tbl>
-      <w:tblPr>
-        <w:tblStyle w:val="TableGrid"/>
-        <w:tblW w:type="auto" w:w="0"/>
-        <w:tblLook w:firstColumn="1" w:firstRow="1" w:lastColumn="0" w:lastRow="0" w:noHBand="0" w:noVBand="1" w:val="04A0"/>
-      </w:tblPr>
-      <w:tblGrid>
-        <w:gridCol w:w="1728"/>
-        <w:gridCol w:w="1728"/>
-        <w:gridCol w:w="1728"/>
-        <w:gridCol w:w="1728"/>
-        <w:gridCol w:w="1728"/>
-      </w:tblGrid>
-      <w:tr>
-        <w:tc>
-          <w:tcPr>
-            <w:tcW w:type="dxa" w:w="1728"/>
-          </w:tcPr>
-          <w:p>
-            <w:pPr>
-              <w:jc w:val="center"/>
-            </w:pPr>
-            <w:r>
-              <w:rPr>
-                <w:b/>
-              </w:rPr>
-              <w:t>점검ID</w:t>
-            </w:r>
-          </w:p>
-        </w:tc>
-        <w:tc>
-          <w:tcPr>
-            <w:tcW w:type="dxa" w:w="1728"/>
-          </w:tcPr>
-          <w:p>
-            <w:pPr>
-              <w:jc w:val="center"/>
-            </w:pPr>
-            <w:r>
-              <w:rPr>
-                <w:b/>
-              </w:rPr>
-              <w:t>점검항목</w:t>
-            </w:r>
-          </w:p>
-        </w:tc>
-        <w:tc>
-          <w:tcPr>
-            <w:tcW w:type="dxa" w:w="1728"/>
-          </w:tcPr>
-          <w:p>
-            <w:pPr>
-              <w:jc w:val="center"/>
-            </w:pPr>
-            <w:r>
-              <w:rPr>
-                <w:b/>
-              </w:rPr>
-              <w:t>상태</w:t>
-            </w:r>
-          </w:p>
-        </w:tc>
-        <w:tc>
-          <w:tcPr>
-            <w:tcW w:type="dxa" w:w="1728"/>
-          </w:tcPr>
-          <w:p>
-            <w:pPr>
-              <w:jc w:val="center"/>
-            </w:pPr>
-            <w:r>
-              <w:rPr>
-                <w:b/>
-              </w:rPr>
-              <w:t>측정값</w:t>
-            </w:r>
-          </w:p>
-        </w:tc>
-        <w:tc>
-          <w:tcPr>
-            <w:tcW w:type="dxa" w:w="1728"/>
-          </w:tcPr>
-          <w:p>
-            <w:pPr>
-              <w:jc w:val="center"/>
-            </w:pPr>
-            <w:r>
-              <w:rPr>
-                <w:b/>
-              </w:rPr>
-              <w:t>결과메시지</w:t>
-            </w:r>
-          </w:p>
-        </w:tc>
-      </w:tr>
-      <w:tr>
-        <w:tc>
-          <w:tcPr>
-            <w:tcW w:type="dxa" w:w="1728"/>
-          </w:tcPr>
-          <w:p>
-            <w:r>
-              <w:t>DB-D1</w:t>
-            </w:r>
-          </w:p>
-        </w:tc>
-        <w:tc>
-          <w:tcPr>
-            <w:tcW w:type="dxa" w:w="1728"/>
-          </w:tcPr>
-          <w:p>
-            <w:r>
-              <w:t>MySQL 연결</w:t>
-            </w:r>
-          </w:p>
-        </w:tc>
-        <w:tc>
-          <w:tcPr>
-            <w:tcW w:type="dxa" w:w="1728"/>
-          </w:tcPr>
-          <w:p>
-            <w:r>
-              <w:rPr>
-                <w:b/>
                 <w:color w:val="FF0000"/>
               </w:rPr>
               <w:t>위험</w:t>
@@ -8477,73 +8050,17 @@
           </w:tcPr>
           <w:p>
             <w:r>
-              <w:t>연결 불가</w:t>
-            </w:r>
-          </w:p>
-        </w:tc>
-        <w:tc>
-          <w:tcPr>
-            <w:tcW w:type="dxa" w:w="1728"/>
-          </w:tcPr>
-          <w:p>
-            <w:r>
-              <w:t>DB 연결 실패</w:t>
-            </w:r>
-          </w:p>
-        </w:tc>
-      </w:tr>
-      <w:tr>
-        <w:tc>
-          <w:tcPr>
-            <w:tcW w:type="dxa" w:w="1728"/>
-          </w:tcPr>
-          <w:p>
-            <w:r>
-              <w:t>DB-D2</w:t>
-            </w:r>
-          </w:p>
-        </w:tc>
-        <w:tc>
-          <w:tcPr>
-            <w:tcW w:type="dxa" w:w="1728"/>
-          </w:tcPr>
-          <w:p>
-            <w:r>
-              <w:t>MySQL 연결</w:t>
-            </w:r>
-          </w:p>
-        </w:tc>
-        <w:tc>
-          <w:tcPr>
-            <w:tcW w:type="dxa" w:w="1728"/>
-          </w:tcPr>
-          <w:p>
-            <w:r>
-              <w:rPr>
-                <w:b/>
-                <w:color w:val="FF0000"/>
-              </w:rPr>
-              <w:t>위험</w:t>
-            </w:r>
-          </w:p>
-        </w:tc>
-        <w:tc>
-          <w:tcPr>
-            <w:tcW w:type="dxa" w:w="1728"/>
-          </w:tcPr>
-          <w:p>
-            <w:r>
-              <w:t>연결 불가</w:t>
-            </w:r>
-          </w:p>
-        </w:tc>
-        <w:tc>
-          <w:tcPr>
-            <w:tcW w:type="dxa" w:w="1728"/>
-          </w:tcPr>
-          <w:p>
-            <w:r>
-              <w:t>DB 연결 실패</w:t>
+              <w:t>0</w:t>
+            </w:r>
+          </w:p>
+        </w:tc>
+        <w:tc>
+          <w:tcPr>
+            <w:tcW w:type="dxa" w:w="1728"/>
+          </w:tcPr>
+          <w:p>
+            <w:r>
+              <w:t>개수 부족 (현재 0/1)</w:t>
             </w:r>
           </w:p>
         </w:tc>
@@ -8694,7 +8211,7 @@
           </w:tcPr>
           <w:p>
             <w:r>
-              <w:t>v1.32.8</w:t>
+              <w:t>v1.34.3</w:t>
             </w:r>
           </w:p>
         </w:tc>
@@ -8750,7 +8267,7 @@
           </w:tcPr>
           <w:p>
             <w:r>
-              <w:t>v2.0.6</w:t>
+              <w:t>v2.2.1</w:t>
             </w:r>
           </w:p>
         </w:tc>
@@ -8806,451 +8323,17 @@
           </w:tcPr>
           <w:p>
             <w:r>
-              <w:t>총 49개 이미지 (상세 생략)</w:t>
-            </w:r>
-          </w:p>
-        </w:tc>
-        <w:tc>
-          <w:tcPr>
-            <w:tcW w:type="dxa" w:w="1728"/>
-          </w:tcPr>
-          <w:p>
-            <w:r>
-              <w:t>이미지 49개 추출 완료</w:t>
-            </w:r>
-          </w:p>
-        </w:tc>
-      </w:tr>
-    </w:tbl>
-    <w:p/>
-    <w:p>
-      <w:pPr>
-        <w:pStyle w:val="Heading3"/>
-      </w:pPr>
-      <w:r>
-        <w:t>Storage</w:t>
-      </w:r>
-    </w:p>
-    <w:tbl>
-      <w:tblPr>
-        <w:tblStyle w:val="TableGrid"/>
-        <w:tblW w:type="auto" w:w="0"/>
-        <w:tblLook w:firstColumn="1" w:firstRow="1" w:lastColumn="0" w:lastRow="0" w:noHBand="0" w:noVBand="1" w:val="04A0"/>
-      </w:tblPr>
-      <w:tblGrid>
-        <w:gridCol w:w="1728"/>
-        <w:gridCol w:w="1728"/>
-        <w:gridCol w:w="1728"/>
-        <w:gridCol w:w="1728"/>
-        <w:gridCol w:w="1728"/>
-      </w:tblGrid>
-      <w:tr>
-        <w:tc>
-          <w:tcPr>
-            <w:tcW w:type="dxa" w:w="1728"/>
-          </w:tcPr>
-          <w:p>
-            <w:pPr>
-              <w:jc w:val="center"/>
-            </w:pPr>
-            <w:r>
-              <w:rPr>
-                <w:b/>
-              </w:rPr>
-              <w:t>점검ID</w:t>
-            </w:r>
-          </w:p>
-        </w:tc>
-        <w:tc>
-          <w:tcPr>
-            <w:tcW w:type="dxa" w:w="1728"/>
-          </w:tcPr>
-          <w:p>
-            <w:pPr>
-              <w:jc w:val="center"/>
-            </w:pPr>
-            <w:r>
-              <w:rPr>
-                <w:b/>
-              </w:rPr>
-              <w:t>점검항목</w:t>
-            </w:r>
-          </w:p>
-        </w:tc>
-        <w:tc>
-          <w:tcPr>
-            <w:tcW w:type="dxa" w:w="1728"/>
-          </w:tcPr>
-          <w:p>
-            <w:pPr>
-              <w:jc w:val="center"/>
-            </w:pPr>
-            <w:r>
-              <w:rPr>
-                <w:b/>
-              </w:rPr>
-              <w:t>상태</w:t>
-            </w:r>
-          </w:p>
-        </w:tc>
-        <w:tc>
-          <w:tcPr>
-            <w:tcW w:type="dxa" w:w="1728"/>
-          </w:tcPr>
-          <w:p>
-            <w:pPr>
-              <w:jc w:val="center"/>
-            </w:pPr>
-            <w:r>
-              <w:rPr>
-                <w:b/>
-              </w:rPr>
-              <w:t>측정값</w:t>
-            </w:r>
-          </w:p>
-        </w:tc>
-        <w:tc>
-          <w:tcPr>
-            <w:tcW w:type="dxa" w:w="1728"/>
-          </w:tcPr>
-          <w:p>
-            <w:pPr>
-              <w:jc w:val="center"/>
-            </w:pPr>
-            <w:r>
-              <w:rPr>
-                <w:b/>
-              </w:rPr>
-              <w:t>결과메시지</w:t>
-            </w:r>
-          </w:p>
-        </w:tc>
-      </w:tr>
-      <w:tr>
-        <w:tc>
-          <w:tcPr>
-            <w:tcW w:type="dxa" w:w="1728"/>
-          </w:tcPr>
-          <w:p>
-            <w:r>
-              <w:t>STG-001</w:t>
-            </w:r>
-          </w:p>
-        </w:tc>
-        <w:tc>
-          <w:tcPr>
-            <w:tcW w:type="dxa" w:w="1728"/>
-          </w:tcPr>
-          <w:p>
-            <w:r>
-              <w:t>NFS 마운트 상태</w:t>
-            </w:r>
-          </w:p>
-        </w:tc>
-        <w:tc>
-          <w:tcPr>
-            <w:tcW w:type="dxa" w:w="1728"/>
-          </w:tcPr>
-          <w:p>
-            <w:r>
-              <w:rPr>
-                <w:b/>
-                <w:color w:val="FF0000"/>
-              </w:rPr>
-              <w:t>위험</w:t>
-            </w:r>
-          </w:p>
-        </w:tc>
-        <w:tc>
-          <w:tcPr>
-            <w:tcW w:type="dxa" w:w="1728"/>
-          </w:tcPr>
-          <w:p>
-            <w:r>
-              <w:t>0</w:t>
-            </w:r>
-          </w:p>
-        </w:tc>
-        <w:tc>
-          <w:tcPr>
-            <w:tcW w:type="dxa" w:w="1728"/>
-          </w:tcPr>
-          <w:p>
-            <w:r>
-              <w:t>부족 (현재 0/1)</w:t>
-            </w:r>
-          </w:p>
-        </w:tc>
-      </w:tr>
-      <w:tr>
-        <w:tc>
-          <w:tcPr>
-            <w:tcW w:type="dxa" w:w="1728"/>
-          </w:tcPr>
-          <w:p>
-            <w:r>
-              <w:t>STG-002</w:t>
-            </w:r>
-          </w:p>
-        </w:tc>
-        <w:tc>
-          <w:tcPr>
-            <w:tcW w:type="dxa" w:w="1728"/>
-          </w:tcPr>
-          <w:p>
-            <w:r>
-              <w:t>NFS 서비스 포트</w:t>
-            </w:r>
-          </w:p>
-        </w:tc>
-        <w:tc>
-          <w:tcPr>
-            <w:tcW w:type="dxa" w:w="1728"/>
-          </w:tcPr>
-          <w:p>
-            <w:r>
-              <w:rPr>
-                <w:b/>
-                <w:color w:val="FF0000"/>
-              </w:rPr>
-              <w:t>위험</w:t>
-            </w:r>
-          </w:p>
-        </w:tc>
-        <w:tc>
-          <w:tcPr>
-            <w:tcW w:type="dxa" w:w="1728"/>
-          </w:tcPr>
-          <w:p>
-            <w:r>
-              <w:t>연결 불가</w:t>
-            </w:r>
-          </w:p>
-        </w:tc>
-        <w:tc>
-          <w:tcPr>
-            <w:tcW w:type="dxa" w:w="1728"/>
-          </w:tcPr>
-          <w:p>
-            <w:r>
-              <w:t>포트 연결 실패</w:t>
-            </w:r>
-          </w:p>
-        </w:tc>
-      </w:tr>
-    </w:tbl>
-    <w:p/>
-    <w:p>
-      <w:pPr>
-        <w:pStyle w:val="Heading3"/>
-      </w:pPr>
-      <w:r>
-        <w:t>Bastion</w:t>
-      </w:r>
-    </w:p>
-    <w:tbl>
-      <w:tblPr>
-        <w:tblStyle w:val="TableGrid"/>
-        <w:tblW w:type="auto" w:w="0"/>
-        <w:tblLook w:firstColumn="1" w:firstRow="1" w:lastColumn="0" w:lastRow="0" w:noHBand="0" w:noVBand="1" w:val="04A0"/>
-      </w:tblPr>
-      <w:tblGrid>
-        <w:gridCol w:w="1728"/>
-        <w:gridCol w:w="1728"/>
-        <w:gridCol w:w="1728"/>
-        <w:gridCol w:w="1728"/>
-        <w:gridCol w:w="1728"/>
-      </w:tblGrid>
-      <w:tr>
-        <w:tc>
-          <w:tcPr>
-            <w:tcW w:type="dxa" w:w="1728"/>
-          </w:tcPr>
-          <w:p>
-            <w:pPr>
-              <w:jc w:val="center"/>
-            </w:pPr>
-            <w:r>
-              <w:rPr>
-                <w:b/>
-              </w:rPr>
-              <w:t>점검ID</w:t>
-            </w:r>
-          </w:p>
-        </w:tc>
-        <w:tc>
-          <w:tcPr>
-            <w:tcW w:type="dxa" w:w="1728"/>
-          </w:tcPr>
-          <w:p>
-            <w:pPr>
-              <w:jc w:val="center"/>
-            </w:pPr>
-            <w:r>
-              <w:rPr>
-                <w:b/>
-              </w:rPr>
-              <w:t>점검항목</w:t>
-            </w:r>
-          </w:p>
-        </w:tc>
-        <w:tc>
-          <w:tcPr>
-            <w:tcW w:type="dxa" w:w="1728"/>
-          </w:tcPr>
-          <w:p>
-            <w:pPr>
-              <w:jc w:val="center"/>
-            </w:pPr>
-            <w:r>
-              <w:rPr>
-                <w:b/>
-              </w:rPr>
-              <w:t>상태</w:t>
-            </w:r>
-          </w:p>
-        </w:tc>
-        <w:tc>
-          <w:tcPr>
-            <w:tcW w:type="dxa" w:w="1728"/>
-          </w:tcPr>
-          <w:p>
-            <w:pPr>
-              <w:jc w:val="center"/>
-            </w:pPr>
-            <w:r>
-              <w:rPr>
-                <w:b/>
-              </w:rPr>
-              <w:t>측정값</w:t>
-            </w:r>
-          </w:p>
-        </w:tc>
-        <w:tc>
-          <w:tcPr>
-            <w:tcW w:type="dxa" w:w="1728"/>
-          </w:tcPr>
-          <w:p>
-            <w:pPr>
-              <w:jc w:val="center"/>
-            </w:pPr>
-            <w:r>
-              <w:rPr>
-                <w:b/>
-              </w:rPr>
-              <w:t>결과메시지</w:t>
-            </w:r>
-          </w:p>
-        </w:tc>
-      </w:tr>
-      <w:tr>
-        <w:tc>
-          <w:tcPr>
-            <w:tcW w:type="dxa" w:w="1728"/>
-          </w:tcPr>
-          <w:p>
-            <w:r>
-              <w:t>BASTION-DEV-NFS</w:t>
-            </w:r>
-          </w:p>
-        </w:tc>
-        <w:tc>
-          <w:tcPr>
-            <w:tcW w:type="dxa" w:w="1728"/>
-          </w:tcPr>
-          <w:p>
-            <w:r>
-              <w:t>NFS (Bastion)</w:t>
-            </w:r>
-          </w:p>
-        </w:tc>
-        <w:tc>
-          <w:tcPr>
-            <w:tcW w:type="dxa" w:w="1728"/>
-          </w:tcPr>
-          <w:p>
-            <w:r>
-              <w:rPr>
-                <w:b/>
-                <w:color w:val="008000"/>
-              </w:rPr>
-              <w:t>정상</w:t>
-            </w:r>
-          </w:p>
-        </w:tc>
-        <w:tc>
-          <w:tcPr>
-            <w:tcW w:type="dxa" w:w="1728"/>
-          </w:tcPr>
-          <w:p>
-            <w:r>
-              <w:t>TCP 2049 Open</w:t>
-            </w:r>
-          </w:p>
-        </w:tc>
-        <w:tc>
-          <w:tcPr>
-            <w:tcW w:type="dxa" w:w="1728"/>
-          </w:tcPr>
-          <w:p>
-            <w:r>
-              <w:t>포트 응답 정상</w:t>
-            </w:r>
-          </w:p>
-        </w:tc>
-      </w:tr>
-      <w:tr>
-        <w:tc>
-          <w:tcPr>
-            <w:tcW w:type="dxa" w:w="1728"/>
-          </w:tcPr>
-          <w:p>
-            <w:r>
-              <w:t>BASTION-DEV-RPC</w:t>
-            </w:r>
-          </w:p>
-        </w:tc>
-        <w:tc>
-          <w:tcPr>
-            <w:tcW w:type="dxa" w:w="1728"/>
-          </w:tcPr>
-          <w:p>
-            <w:r>
-              <w:t>RPC (Bastion)</w:t>
-            </w:r>
-          </w:p>
-        </w:tc>
-        <w:tc>
-          <w:tcPr>
-            <w:tcW w:type="dxa" w:w="1728"/>
-          </w:tcPr>
-          <w:p>
-            <w:r>
-              <w:rPr>
-                <w:b/>
-                <w:color w:val="008000"/>
-              </w:rPr>
-              <w:t>정상</w:t>
-            </w:r>
-          </w:p>
-        </w:tc>
-        <w:tc>
-          <w:tcPr>
-            <w:tcW w:type="dxa" w:w="1728"/>
-          </w:tcPr>
-          <w:p>
-            <w:r>
-              <w:t>TCP 111 Open</w:t>
-            </w:r>
-          </w:p>
-        </w:tc>
-        <w:tc>
-          <w:tcPr>
-            <w:tcW w:type="dxa" w:w="1728"/>
-          </w:tcPr>
-          <w:p>
-            <w:r>
-              <w:t>포트 응답 정상</w:t>
+              <w:t>총 172개 이미지 (상세 생략)</w:t>
+            </w:r>
+          </w:p>
+        </w:tc>
+        <w:tc>
+          <w:tcPr>
+            <w:tcW w:type="dxa" w:w="1728"/>
+          </w:tcPr>
+          <w:p>
+            <w:r>
+              <w:t>이미지 172개 추출 완료</w:t>
             </w:r>
           </w:p>
         </w:tc>
@@ -9270,15 +8353,15 @@
         <w:rPr>
           <w:b/>
         </w:rPr>
-        <w:t>[위험] [APP-ARGO-01] ArgoCD Server</w:t>
+        <w:t>[위험] [CICD-repo-Repository] Repository 서비스</w:t>
       </w:r>
       <w:r>
         <w:br/>
-        <w:t xml:space="preserve">   - 환경: DEV</w:t>
+        <w:t xml:space="preserve">   - 환경: CI/CD 인프라</w:t>
       </w:r>
       <w:r>
         <w:br/>
-        <w:t xml:space="preserve">   - 대상: DEV Apps</w:t>
+        <w:t xml:space="preserve">   - 대상: Repo 서버</w:t>
       </w:r>
       <w:r>
         <w:br/>
@@ -9286,11 +8369,11 @@
       </w:r>
       <w:r>
         <w:br/>
-        <w:t xml:space="preserve">   - 측정값: 0</w:t>
+        <w:t xml:space="preserve">   - 측정값: 연결 실패</w:t>
       </w:r>
       <w:r>
         <w:br/>
-        <w:t xml:space="preserve">   - 메시지: 개수 부족 (현재 0/1)</w:t>
+        <w:t xml:space="preserve">   - 메시지: 서비스 응답 없음</w:t>
       </w:r>
       <w:r>
         <w:br/>
@@ -9302,15 +8385,15 @@
         <w:rPr>
           <w:b/>
         </w:rPr>
-        <w:t>[위험] [APP-HBR-01] Harbor Core</w:t>
+        <w:t>[위험] [CICD-nexus-Nexus_Web] Nexus Web 서비스</w:t>
       </w:r>
       <w:r>
         <w:br/>
-        <w:t xml:space="preserve">   - 환경: DEV</w:t>
+        <w:t xml:space="preserve">   - 환경: CI/CD 인프라</w:t>
       </w:r>
       <w:r>
         <w:br/>
-        <w:t xml:space="preserve">   - 대상: DEV Apps</w:t>
+        <w:t xml:space="preserve">   - 대상: Nexus 서버</w:t>
       </w:r>
       <w:r>
         <w:br/>
@@ -9318,11 +8401,11 @@
       </w:r>
       <w:r>
         <w:br/>
-        <w:t xml:space="preserve">   - 측정값: 0</w:t>
+        <w:t xml:space="preserve">   - 측정값: 연결 실패</w:t>
       </w:r>
       <w:r>
         <w:br/>
-        <w:t xml:space="preserve">   - 메시지: 개수 부족 (현재 0/1)</w:t>
+        <w:t xml:space="preserve">   - 메시지: 서비스 응답 없음</w:t>
       </w:r>
       <w:r>
         <w:br/>
@@ -9334,15 +8417,15 @@
         <w:rPr>
           <w:b/>
         </w:rPr>
-        <w:t>[위험] [APP-HBR-02] Harbor Registry</w:t>
+        <w:t>[위험] [CICD-jenkins_primary-Jenkins] Jenkins 서비스</w:t>
       </w:r>
       <w:r>
         <w:br/>
-        <w:t xml:space="preserve">   - 환경: DEV</w:t>
+        <w:t xml:space="preserve">   - 환경: CI/CD 인프라</w:t>
       </w:r>
       <w:r>
         <w:br/>
-        <w:t xml:space="preserve">   - 대상: DEV Apps</w:t>
+        <w:t xml:space="preserve">   - 대상: Jenkins #1 (Primary)</w:t>
       </w:r>
       <w:r>
         <w:br/>
@@ -9350,11 +8433,11 @@
       </w:r>
       <w:r>
         <w:br/>
-        <w:t xml:space="preserve">   - 측정값: 0</w:t>
+        <w:t xml:space="preserve">   - 측정값: 연결 실패</w:t>
       </w:r>
       <w:r>
         <w:br/>
-        <w:t xml:space="preserve">   - 메시지: 개수 부족 (현재 0/1)</w:t>
+        <w:t xml:space="preserve">   - 메시지: 서비스 응답 없음</w:t>
       </w:r>
       <w:r>
         <w:br/>
@@ -9366,15 +8449,15 @@
         <w:rPr>
           <w:b/>
         </w:rPr>
-        <w:t>[위험] [APP-MON-01] Grafana</w:t>
+        <w:t>[위험] [CICD-jenkins_secondary-Jenkins] Jenkins 서비스</w:t>
       </w:r>
       <w:r>
         <w:br/>
-        <w:t xml:space="preserve">   - 환경: DEV</w:t>
+        <w:t xml:space="preserve">   - 환경: CI/CD 인프라</w:t>
       </w:r>
       <w:r>
         <w:br/>
-        <w:t xml:space="preserve">   - 대상: DEV Apps</w:t>
+        <w:t xml:space="preserve">   - 대상: Jenkins #2 (Backup)</w:t>
       </w:r>
       <w:r>
         <w:br/>
@@ -9382,11 +8465,171 @@
       </w:r>
       <w:r>
         <w:br/>
-        <w:t xml:space="preserve">   - 측정값: 0</w:t>
+        <w:t xml:space="preserve">   - 측정값: 연결 실패</w:t>
       </w:r>
       <w:r>
         <w:br/>
-        <w:t xml:space="preserve">   - 메시지: 개수 부족 (현재 0/1)</w:t>
+        <w:t xml:space="preserve">   - 메시지: 서비스 응답 없음</w:t>
+      </w:r>
+      <w:r>
+        <w:br/>
+        <w:t xml:space="preserve">   - 중요도: critical</w:t>
+      </w:r>
+    </w:p>
+    <w:p>
+      <w:r>
+        <w:rPr>
+          <w:b/>
+        </w:rPr>
+        <w:t>[위험] [CICD-gitlab_primary-GitLab] GitLab 서비스</w:t>
+      </w:r>
+      <w:r>
+        <w:br/>
+        <w:t xml:space="preserve">   - 환경: CI/CD 인프라</w:t>
+      </w:r>
+      <w:r>
+        <w:br/>
+        <w:t xml:space="preserve">   - 대상: GitLab #1</w:t>
+      </w:r>
+      <w:r>
+        <w:br/>
+        <w:t xml:space="preserve">   - 상태: 위험</w:t>
+      </w:r>
+      <w:r>
+        <w:br/>
+        <w:t xml:space="preserve">   - 측정값: 연결 실패</w:t>
+      </w:r>
+      <w:r>
+        <w:br/>
+        <w:t xml:space="preserve">   - 메시지: 서비스 응답 없음</w:t>
+      </w:r>
+      <w:r>
+        <w:br/>
+        <w:t xml:space="preserve">   - 중요도: critical</w:t>
+      </w:r>
+    </w:p>
+    <w:p>
+      <w:r>
+        <w:rPr>
+          <w:b/>
+        </w:rPr>
+        <w:t>[위험] [CICD-gitlab_secondary-GitLab] GitLab 서비스</w:t>
+      </w:r>
+      <w:r>
+        <w:br/>
+        <w:t xml:space="preserve">   - 환경: CI/CD 인프라</w:t>
+      </w:r>
+      <w:r>
+        <w:br/>
+        <w:t xml:space="preserve">   - 대상: GitLab #2</w:t>
+      </w:r>
+      <w:r>
+        <w:br/>
+        <w:t xml:space="preserve">   - 상태: 위험</w:t>
+      </w:r>
+      <w:r>
+        <w:br/>
+        <w:t xml:space="preserve">   - 측정값: 연결 실패</w:t>
+      </w:r>
+      <w:r>
+        <w:br/>
+        <w:t xml:space="preserve">   - 메시지: 서비스 응답 없음</w:t>
+      </w:r>
+      <w:r>
+        <w:br/>
+        <w:t xml:space="preserve">   - 중요도: critical</w:t>
+      </w:r>
+    </w:p>
+    <w:p>
+      <w:r>
+        <w:rPr>
+          <w:b/>
+        </w:rPr>
+        <w:t>[위험] [K8S-005] Warning 이벤트</w:t>
+      </w:r>
+      <w:r>
+        <w:br/>
+        <w:t xml:space="preserve">   - 환경: GPU</w:t>
+      </w:r>
+      <w:r>
+        <w:br/>
+        <w:t xml:space="preserve">   - 대상: GPU Cluster</w:t>
+      </w:r>
+      <w:r>
+        <w:br/>
+        <w:t xml:space="preserve">   - 상태: 위험</w:t>
+      </w:r>
+      <w:r>
+        <w:br/>
+        <w:t xml:space="preserve">   - 측정값: 64</w:t>
+      </w:r>
+      <w:r>
+        <w:br/>
+        <w:t xml:space="preserve">   - 메시지: 임계치 초과 (64개 / 50개)</w:t>
+      </w:r>
+      <w:r>
+        <w:br/>
+        <w:t xml:space="preserve">   - 중요도: medium</w:t>
+      </w:r>
+    </w:p>
+    <w:p>
+      <w:r>
+        <w:rPr>
+          <w:b/>
+        </w:rPr>
+        <w:t>[경고] [SVC-002] StatefulSet 상태</w:t>
+      </w:r>
+      <w:r>
+        <w:br/>
+        <w:t xml:space="preserve">   - 환경: GPU</w:t>
+      </w:r>
+      <w:r>
+        <w:br/>
+        <w:t xml:space="preserve">   - 대상: GPU Services</w:t>
+      </w:r>
+      <w:r>
+        <w:br/>
+        <w:t xml:space="preserve">   - 상태: 경고</w:t>
+      </w:r>
+      <w:r>
+        <w:br/>
+        <w:t xml:space="preserve">   - 측정값: vault:0/1</w:t>
+      </w:r>
+      <w:r>
+        <w:br/>
+        <w:t xml:space="preserve">   - 메시지: 불일치 리소스 1개</w:t>
+      </w:r>
+      <w:r>
+        <w:br/>
+        <w:t xml:space="preserve">   - 중요도: high</w:t>
+      </w:r>
+    </w:p>
+    <w:p>
+      <w:r>
+        <w:rPr>
+          <w:b/>
+        </w:rPr>
+        <w:t>[경고] [SVC-004] Service Endpoints</w:t>
+      </w:r>
+      <w:r>
+        <w:br/>
+        <w:t xml:space="preserve">   - 환경: GPU</w:t>
+      </w:r>
+      <w:r>
+        <w:br/>
+        <w:t xml:space="preserve">   - 대상: GPU Services</w:t>
+      </w:r>
+      <w:r>
+        <w:br/>
+        <w:t xml:space="preserve">   - 상태: 경고</w:t>
+      </w:r>
+      <w:r>
+        <w:br/>
+        <w:t xml:space="preserve">   - 측정값: 1</w:t>
+      </w:r>
+      <w:r>
+        <w:br/>
+        <w:t xml:space="preserve">   - 메시지: 주의 필요 (1.0개)</w:t>
       </w:r>
       <w:r>
         <w:br/>
@@ -9402,11 +8645,11 @@
       </w:r>
       <w:r>
         <w:br/>
-        <w:t xml:space="preserve">   - 환경: DEV</w:t>
+        <w:t xml:space="preserve">   - 환경: GPU</w:t>
       </w:r>
       <w:r>
         <w:br/>
-        <w:t xml:space="preserve">   - 대상: DEV Apps</w:t>
+        <w:t xml:space="preserve">   - 대상: GPU Apps</w:t>
       </w:r>
       <w:r>
         <w:br/>
@@ -9430,111 +8673,15 @@
         <w:rPr>
           <w:b/>
         </w:rPr>
-        <w:t>[위험] [APP-KEY-01] Keycloak</w:t>
-      </w:r>
-      <w:r>
-        <w:br/>
-        <w:t xml:space="preserve">   - 환경: DEV</w:t>
-      </w:r>
-      <w:r>
-        <w:br/>
-        <w:t xml:space="preserve">   - 대상: DEV Apps</w:t>
-      </w:r>
-      <w:r>
-        <w:br/>
-        <w:t xml:space="preserve">   - 상태: 위험</w:t>
-      </w:r>
-      <w:r>
-        <w:br/>
-        <w:t xml:space="preserve">   - 측정값: 0</w:t>
-      </w:r>
-      <w:r>
-        <w:br/>
-        <w:t xml:space="preserve">   - 메시지: 개수 부족 (현재 0/1)</w:t>
-      </w:r>
-      <w:r>
-        <w:br/>
-        <w:t xml:space="preserve">   - 중요도: critical</w:t>
-      </w:r>
-    </w:p>
-    <w:p>
-      <w:r>
-        <w:rPr>
-          <w:b/>
-        </w:rPr>
-        <w:t>[위험] [APP-LOKI-01] Loki Gateway</w:t>
-      </w:r>
-      <w:r>
-        <w:br/>
-        <w:t xml:space="preserve">   - 환경: DEV</w:t>
-      </w:r>
-      <w:r>
-        <w:br/>
-        <w:t xml:space="preserve">   - 대상: DEV Apps</w:t>
-      </w:r>
-      <w:r>
-        <w:br/>
-        <w:t xml:space="preserve">   - 상태: 위험</w:t>
-      </w:r>
-      <w:r>
-        <w:br/>
-        <w:t xml:space="preserve">   - 측정값: 0</w:t>
-      </w:r>
-      <w:r>
-        <w:br/>
-        <w:t xml:space="preserve">   - 메시지: 개수 부족 (현재 0/1)</w:t>
-      </w:r>
-      <w:r>
-        <w:br/>
-        <w:t xml:space="preserve">   - 중요도: high</w:t>
-      </w:r>
-    </w:p>
-    <w:p>
-      <w:r>
-        <w:rPr>
-          <w:b/>
-        </w:rPr>
-        <w:t>[위험] [APP-LOKI-02] Loki Write/Read</w:t>
-      </w:r>
-      <w:r>
-        <w:br/>
-        <w:t xml:space="preserve">   - 환경: DEV</w:t>
-      </w:r>
-      <w:r>
-        <w:br/>
-        <w:t xml:space="preserve">   - 대상: DEV Apps</w:t>
-      </w:r>
-      <w:r>
-        <w:br/>
-        <w:t xml:space="preserve">   - 상태: 위험</w:t>
-      </w:r>
-      <w:r>
-        <w:br/>
-        <w:t xml:space="preserve">   - 측정값: 0</w:t>
-      </w:r>
-      <w:r>
-        <w:br/>
-        <w:t xml:space="preserve">   - 메시지: 개수 부족 (현재 0/2)</w:t>
-      </w:r>
-      <w:r>
-        <w:br/>
-        <w:t xml:space="preserve">   - 중요도: medium</w:t>
-      </w:r>
-    </w:p>
-    <w:p>
-      <w:r>
-        <w:rPr>
-          <w:b/>
-        </w:rPr>
         <w:t>[위험] [APP-RABBIT-01] RabbitMQ</w:t>
       </w:r>
       <w:r>
         <w:br/>
-        <w:t xml:space="preserve">   - 환경: DEV</w:t>
+        <w:t xml:space="preserve">   - 환경: GPU</w:t>
       </w:r>
       <w:r>
         <w:br/>
-        <w:t xml:space="preserve">   - 대상: DEV Apps</w:t>
+        <w:t xml:space="preserve">   - 대상: GPU Apps</w:t>
       </w:r>
       <w:r>
         <w:br/>
@@ -9562,11 +8709,11 @@
       </w:r>
       <w:r>
         <w:br/>
-        <w:t xml:space="preserve">   - 환경: DEV</w:t>
+        <w:t xml:space="preserve">   - 환경: GPU</w:t>
       </w:r>
       <w:r>
         <w:br/>
-        <w:t xml:space="preserve">   - 대상: DEV Apps</w:t>
+        <w:t xml:space="preserve">   - 대상: GPU Apps</w:t>
       </w:r>
       <w:r>
         <w:br/>
@@ -9590,79 +8737,15 @@
         <w:rPr>
           <w:b/>
         </w:rPr>
-        <w:t>[위험] [DB-D1] MySQL 연결</w:t>
+        <w:t>[위험] [APP-TRAEFIK-01] Traefik</w:t>
       </w:r>
       <w:r>
         <w:br/>
-        <w:t xml:space="preserve">   - 환경: DEV</w:t>
+        <w:t xml:space="preserve">   - 환경: GPU</w:t>
       </w:r>
       <w:r>
         <w:br/>
-        <w:t xml:space="preserve">   - 대상: DEV DB #1</w:t>
-      </w:r>
-      <w:r>
-        <w:br/>
-        <w:t xml:space="preserve">   - 상태: 위험</w:t>
-      </w:r>
-      <w:r>
-        <w:br/>
-        <w:t xml:space="preserve">   - 측정값: 연결 불가</w:t>
-      </w:r>
-      <w:r>
-        <w:br/>
-        <w:t xml:space="preserve">   - 메시지: DB 연결 실패</w:t>
-      </w:r>
-      <w:r>
-        <w:br/>
-        <w:t xml:space="preserve">   - 중요도: critical</w:t>
-      </w:r>
-    </w:p>
-    <w:p>
-      <w:r>
-        <w:rPr>
-          <w:b/>
-        </w:rPr>
-        <w:t>[위험] [DB-D2] MySQL 연결</w:t>
-      </w:r>
-      <w:r>
-        <w:br/>
-        <w:t xml:space="preserve">   - 환경: DEV</w:t>
-      </w:r>
-      <w:r>
-        <w:br/>
-        <w:t xml:space="preserve">   - 대상: DEV DB #2</w:t>
-      </w:r>
-      <w:r>
-        <w:br/>
-        <w:t xml:space="preserve">   - 상태: 위험</w:t>
-      </w:r>
-      <w:r>
-        <w:br/>
-        <w:t xml:space="preserve">   - 측정값: 연결 불가</w:t>
-      </w:r>
-      <w:r>
-        <w:br/>
-        <w:t xml:space="preserve">   - 메시지: DB 연결 실패</w:t>
-      </w:r>
-      <w:r>
-        <w:br/>
-        <w:t xml:space="preserve">   - 중요도: critical</w:t>
-      </w:r>
-    </w:p>
-    <w:p>
-      <w:r>
-        <w:rPr>
-          <w:b/>
-        </w:rPr>
-        <w:t>[위험] [STG-001] NFS 마운트 상태</w:t>
-      </w:r>
-      <w:r>
-        <w:br/>
-        <w:t xml:space="preserve">   - 환경: DEV</w:t>
-      </w:r>
-      <w:r>
-        <w:br/>
-        <w:t xml:space="preserve">   - 대상: DEV Cluster</w:t>
+        <w:t xml:space="preserve">   - 대상: GPU Apps</w:t>
       </w:r>
       <w:r>
         <w:br/>
@@ -9674,39 +8757,7 @@
       </w:r>
       <w:r>
         <w:br/>
-        <w:t xml:space="preserve">   - 메시지: 부족 (현재 0/1)</w:t>
-      </w:r>
-      <w:r>
-        <w:br/>
-        <w:t xml:space="preserve">   - 중요도: critical</w:t>
-      </w:r>
-    </w:p>
-    <w:p>
-      <w:r>
-        <w:rPr>
-          <w:b/>
-        </w:rPr>
-        <w:t>[위험] [STG-002] NFS 서비스 포트</w:t>
-      </w:r>
-      <w:r>
-        <w:br/>
-        <w:t xml:space="preserve">   - 환경: DEV</w:t>
-      </w:r>
-      <w:r>
-        <w:br/>
-        <w:t xml:space="preserve">   - 대상: DEV Cluster</w:t>
-      </w:r>
-      <w:r>
-        <w:br/>
-        <w:t xml:space="preserve">   - 상태: 위험</w:t>
-      </w:r>
-      <w:r>
-        <w:br/>
-        <w:t xml:space="preserve">   - 측정값: 연결 불가</w:t>
-      </w:r>
-      <w:r>
-        <w:br/>
-        <w:t xml:space="preserve">   - 메시지: 포트 연결 실패</w:t>
+        <w:t xml:space="preserve">   - 메시지: 개수 부족 (현재 0/1)</w:t>
       </w:r>
       <w:r>
         <w:br/>
@@ -9734,7 +8785,7 @@
         <w:br/>
       </w:r>
       <w:r>
-        <w:t>점검일: 2026년 02월 24일</w:t>
+        <w:t>점검일: 2026년 02월 26일</w:t>
       </w:r>
     </w:p>
     <w:sectPr>

</xml_diff>